<commit_message>
eurosteklo-edm: TZ: Eurosteklo 1C developer question pack (atom eurosteklo-xeb, claude-7934)
ТЗ: /root/workspaces/projects/clients/eurosteklo/.worktrees/claude/eurosteklo-edm/docs/tz/2026-10-15-1c-questions.md#U3
Atom: eurosteklo-edm
Agent: claude
</commit_message>
<xml_diff>
--- a/docs/meetings/2026-10-15-1c-call/1c-voprosy-roman.docx
+++ b/docs/meetings/2026-10-15-1c-call/1c-voprosy-roman.docx
@@ -98,14 +98,6 @@
         <w:t xml:space="preserve">Доступ к копии базы для ARWOX (В23).</w:t>
       </w:r>
     </w:p>
-    <w:p>
-      <w:pPr>
-        <w:pStyle w:val="FirstParagraph"/>
-      </w:pPr>
-      <w:r>
-        <w:t xml:space="preserve">Метки: [PROVEN] — сказано в звонке, с тайм-кодом (мм:сс); [INFERRED] — вывод аналитика; [UNVERIFIED] — не подтверждено.</w:t>
-      </w:r>
-    </w:p>
     <w:bookmarkEnd w:id="21"/>
     <w:bookmarkStart w:id="22" w:name="кратко-о-звонке"/>
     <w:p>
@@ -125,7 +117,7 @@
         <w:pStyle w:val="Compact"/>
       </w:pPr>
       <w:r>
-        <w:t xml:space="preserve">Евро стекло просит интеграцию Битрикс24 с учётной системой 1С: обмен документами по бизнес-процессу, от номенклатуры и договора до заказа и счёта (00:12, 00:33) [PROVEN].</w:t>
+        <w:t xml:space="preserve">Евро стекло просит интеграцию Битрикс24 с учётной системой 1С: обмен документами по бизнес-процессу, от номенклатуры и договора до заказа и счёта (00:12, 00:33).</w:t>
       </w:r>
     </w:p>
     <w:p>
@@ -137,7 +129,7 @@
         <w:pStyle w:val="Compact"/>
       </w:pPr>
       <w:r>
-        <w:t xml:space="preserve">Мастер-система остаётся 1С как учётная; в Битрикс24 документы только для просмотра и отправки, редактирование через 1С (02:04, 03:16) [PROVEN].</w:t>
+        <w:t xml:space="preserve">Мастер-система остаётся 1С как учётная; в Битрикс24 документы только для просмотра и отправки, редактирование через 1С (02:04, 03:16).</w:t>
       </w:r>
     </w:p>
     <w:p>
@@ -149,7 +141,7 @@
         <w:pStyle w:val="Compact"/>
       </w:pPr>
       <w:r>
-        <w:t xml:space="preserve">Статусная модель 1С не утверждена; Роман сказал, что статусы поменяют и переименуют под названия из Битрикс24, лишние скроют; ориентир — доска Miro (48:53, 49:44, 50:24, 51:27) [PROVEN].</w:t>
+        <w:t xml:space="preserve">Статусная модель 1С не утверждена; Роман сказал, что статусы поменяют и переименуют под названия из Битрикс24, лишние скроют; ориентир — доска Miro (48:53, 49:44, 50:24, 51:27).</w:t>
       </w:r>
     </w:p>
     <w:p>
@@ -161,7 +153,7 @@
         <w:pStyle w:val="Compact"/>
       </w:pPr>
       <w:r>
-        <w:t xml:space="preserve">Андрей предупредил: интегрировать неправильно работающую мастер-систему нельзя, 1С нужно исправить до интеграции; Роман: «хорошо, я понял» (58:49, 59:45) [PROVEN].</w:t>
+        <w:t xml:space="preserve">Андрей предупредил: интегрировать неправильно работающую мастер-систему нельзя, 1С нужно исправить до интеграции; Роман: «хорошо, я понял» (58:49, 59:45).</w:t>
       </w:r>
     </w:p>
     <w:p>
@@ -173,7 +165,7 @@
         <w:pStyle w:val="Compact"/>
       </w:pPr>
       <w:r>
-        <w:t xml:space="preserve">Доступ к 1С: Роман: «подпишем с вами бумагу, и, конечно, вопросов нет» (59:47, 01:00:01) [PROVEN].</w:t>
+        <w:t xml:space="preserve">Доступ к 1С: Роман: «подпишем с вами бумагу, и, конечно, вопросов нет» (59:47, 01:00:01).</w:t>
       </w:r>
     </w:p>
     <w:p>
@@ -185,7 +177,7 @@
         <w:pStyle w:val="Compact"/>
       </w:pPr>
       <w:r>
-        <w:t xml:space="preserve">Андрей вернётся с обратной связью по предварительной стоимости (01:00:06); предварительная стоимость и сроки не названы [UNVERIFIED].</w:t>
+        <w:t xml:space="preserve">Андрей вернётся с обратной связью по предварительной стоимости (01:00:06); предварительная стоимость и сроки не названы.</w:t>
       </w:r>
     </w:p>
     <w:bookmarkEnd w:id="22"/>
@@ -276,19 +268,7 @@
         <w:pStyle w:val="Compact"/>
       </w:pPr>
       <w:r>
-        <w:t xml:space="preserve">Статус ответа: слабо — описаны симптомы, причина не названа [PROVEN (57:26)]</w:t>
-      </w:r>
-    </w:p>
-    <w:p>
-      <w:pPr>
-        <w:numPr>
-          <w:ilvl w:val="0"/>
-          <w:numId w:val="1003"/>
-        </w:numPr>
-        <w:pStyle w:val="Compact"/>
-      </w:pPr>
-      <w:r>
-        <w:t xml:space="preserve">Ответ на встрече: Роман сказал, что один менеджер исчез из системы, его заказы автоматически повисли на Романе, а ранее распределённые заказы вернулись к нему, как будто работа откатилась примерно на два месяца; в звонке речь о заказах, не о задачах [PROVEN (57:26)]</w:t>
+        <w:t xml:space="preserve">Ответ на встрече: Роман сказал, что один менеджер исчез из системы, его заказы автоматически повисли на Романе, а ранее распределённые заказы вернулись к нему, как будто работа откатилась примерно на два месяца; в звонке речь о заказах, не о задачах</w:t>
       </w:r>
     </w:p>
     <w:bookmarkEnd w:id="23"/>
@@ -370,19 +350,7 @@
         <w:pStyle w:val="Compact"/>
       </w:pPr>
       <w:r>
-        <w:t xml:space="preserve">Статус ответа: не отвечен — в звонке не обсуждалось [INFERRED]</w:t>
-      </w:r>
-    </w:p>
-    <w:p>
-      <w:pPr>
-        <w:numPr>
-          <w:ilvl w:val="0"/>
-          <w:numId w:val="1004"/>
-        </w:numPr>
-        <w:pStyle w:val="Compact"/>
-      </w:pPr>
-      <w:r>
-        <w:t xml:space="preserve">Ответ на встрече: нет; Роман лишь сказал, что процесс адаптации 1С под бизнес-модель идёт постоянно (54:21) [PROVEN (54:21)]</w:t>
+        <w:t xml:space="preserve">Ответ на встрече: нет; Роман лишь сказал, что процесс адаптации 1С под бизнес-модель идёт постоянно (54:21)</w:t>
       </w:r>
     </w:p>
     <w:bookmarkEnd w:id="24"/>
@@ -464,19 +432,7 @@
         <w:pStyle w:val="Compact"/>
       </w:pPr>
       <w:r>
-        <w:t xml:space="preserve">Статус ответа: слабо — причина названа предположительно, последствия не описаны [PROVEN (12:21)]</w:t>
-      </w:r>
-    </w:p>
-    <w:p>
-      <w:pPr>
-        <w:numPr>
-          <w:ilvl w:val="0"/>
-          <w:numId w:val="1005"/>
-        </w:numPr>
-        <w:pStyle w:val="Compact"/>
-      </w:pPr>
-      <w:r>
-        <w:t xml:space="preserve">Ответ на встрече: Роман не знает причину цен, предполагает сбой после «разбомбили сервера» (12:07, 12:21); позже сказал, что работа как будто откатилась на пару месяцев (57:26) [PROVEN (12:07), PROVEN (57:26)]</w:t>
+        <w:t xml:space="preserve">Ответ на встрече: Роман не знает причину цен, предполагает сбой после «разбомбили сервера» (12:07, 12:21); позже сказал, что работа как будто откатилась на пару месяцев (57:26)</w:t>
       </w:r>
     </w:p>
     <w:bookmarkEnd w:id="25"/>
@@ -558,19 +514,7 @@
         <w:pStyle w:val="Compact"/>
       </w:pPr>
       <w:r>
-        <w:t xml:space="preserve">Статус ответа: слабо — Роман пообещал переименовать статусы и упростить, текущего соответствия не показано [PROVEN (48:53), PROVEN (50:24)]</w:t>
-      </w:r>
-    </w:p>
-    <w:p>
-      <w:pPr>
-        <w:numPr>
-          <w:ilvl w:val="0"/>
-          <w:numId w:val="1006"/>
-        </w:numPr>
-        <w:pStyle w:val="Compact"/>
-      </w:pPr>
-      <w:r>
-        <w:t xml:space="preserve">Ответ на встрече: Роман: текущие статусы будут менять, лишние скроют, названия приведут к тем, что на доске «Мира» (в записи «по Мира доске», вероятно Miro, INFERRED); Андрей спросил, группирует ли текущая интеграция несколько состояний 1С в один этап Битрикс, ответа по факту нет; про оплату Роман сказал, что смена состояния ведётся вручную (23:40), но тут же — что оплата подтягивается и состояние меняется (36:13) [PROVEN (48:53), PROVEN (50:24), PROVEN (23:40), PROVEN (36:13)]</w:t>
+        <w:t xml:space="preserve">Ответ на встрече: Роман: текущие статусы будут менять, лишние скроют, названия приведут к тем, что на доске «Мира» (в записи «по Мира доске», вероятно Miro); Андрей спросил, группирует ли текущая интеграция несколько состояний 1С в один этап Битрикс, ответа по факту нет; про оплату Роман сказал, что смена состояния ведётся вручную (23:40), но тут же — что оплата подтягивается и состояние меняется (36:13)</w:t>
       </w:r>
     </w:p>
     <w:bookmarkEnd w:id="26"/>
@@ -652,19 +596,7 @@
         <w:pStyle w:val="Compact"/>
       </w:pPr>
       <w:r>
-        <w:t xml:space="preserve">Статус ответа: слабо — факт изменений признан, частота не названа [PROVEN (33:02)]</w:t>
-      </w:r>
-    </w:p>
-    <w:p>
-      <w:pPr>
-        <w:numPr>
-          <w:ilvl w:val="0"/>
-          <w:numId w:val="1007"/>
-        </w:numPr>
-        <w:pStyle w:val="Compact"/>
-      </w:pPr>
-      <w:r>
-        <w:t xml:space="preserve">Ответ на встрече: Андрей спросил, как часто меняют печатные формы; Виталий ответил, что такое может быть: в заказы и реализации вносят изменения; частоты нет [PROVEN (32:26), PROVEN (33:02)]</w:t>
+        <w:t xml:space="preserve">Ответ на встрече: Андрей спросил, как часто меняют печатные формы; Виталий ответил, что такое может быть: в заказы и реализации вносят изменения; частоты нет</w:t>
       </w:r>
     </w:p>
     <w:bookmarkEnd w:id="27"/>
@@ -746,19 +678,7 @@
         <w:pStyle w:val="Compact"/>
       </w:pPr>
       <w:r>
-        <w:t xml:space="preserve">Статус ответа: слабо — принципиально согласились, технические условия не оговорены [PROVEN (59:47)]</w:t>
-      </w:r>
-    </w:p>
-    <w:p>
-      <w:pPr>
-        <w:numPr>
-          <w:ilvl w:val="0"/>
-          <w:numId w:val="1008"/>
-        </w:numPr>
-        <w:pStyle w:val="Compact"/>
-      </w:pPr>
-      <w:r>
-        <w:t xml:space="preserve">Ответ на встрече: Андрей: копию базы можно передать; Роман: подпишем бумагу, вопросов нет (01:00:01) [PROVEN (59:47), PROVEN (01:00:01)]</w:t>
+        <w:t xml:space="preserve">Ответ на встрече: Андрей: копию базы можно передать; Роман: подпишем бумагу, вопросов нет (01:00:01)</w:t>
       </w:r>
     </w:p>
     <w:bookmarkEnd w:id="28"/>
@@ -781,7 +701,7 @@
         <w:pStyle w:val="Compact"/>
       </w:pPr>
       <w:r>
-        <w:t xml:space="preserve">Прислать контакты Виталия: Спикер 1 просит Романа «скинуть» его телеграм, почту, телефон (01:00:32) [PROVEN]. Срок отправки не назван [UNVERIFIED].</w:t>
+        <w:t xml:space="preserve">Прислать контакты Виталия: Спикер 1 просит Романа «скинуть» его телеграм, почту, телефон (01:00:32). Срок отправки не назван.</w:t>
       </w:r>
     </w:p>
     <w:p>
@@ -793,7 +713,7 @@
         <w:pStyle w:val="Compact"/>
       </w:pPr>
       <w:r>
-        <w:t xml:space="preserve">Подписать документ о доступе: «подпишем с вами бумагу, и, конечно, вопросов нет» (59:47, 01:00:01) [PROVEN].</w:t>
+        <w:t xml:space="preserve">Подписать документ о доступе: «подпишем с вами бумагу, и, конечно, вопросов нет» (59:47, 01:00:01).</w:t>
       </w:r>
     </w:p>
     <w:p>
@@ -805,7 +725,7 @@
         <w:pStyle w:val="Compact"/>
       </w:pPr>
       <w:r>
-        <w:t xml:space="preserve">Согласовать статусную модель: статусы поменяют и переименуют под названия из Битрикс24, лишние скроют; ориентир — доска Miro (48:53, 49:44, 50:24, 51:27) [PROVEN]. Андрей предупредил: новые или удалённые статусы после реализации = доработки и рост стоимости (50:58) [PROVEN].</w:t>
+        <w:t xml:space="preserve">Согласовать статусную модель: статусы поменяют и переименуют под названия из Битрикс24, лишние скроют; ориентир — доска Miro (48:53, 49:44, 50:24, 51:27). Андрей предупредил: новые или удалённые статусы после реализации = доработки и рост стоимости (50:58).</w:t>
       </w:r>
     </w:p>
     <w:p>
@@ -817,7 +737,7 @@
         <w:pStyle w:val="Compact"/>
       </w:pPr>
       <w:r>
-        <w:t xml:space="preserve">Имя пользователя-бота на портале Битрикс24 в звонке не названо; его сообщают Андрей или Роман [UNVERIFIED]. Если вам оно известно, сообщите.</w:t>
+        <w:t xml:space="preserve">Имя пользователя-бота на портале Битрикс24 в звонке не названо; его сообщают Андрей или Роман. Если вам оно известно, сообщите.</w:t>
       </w:r>
     </w:p>
     <w:p>
@@ -829,7 +749,7 @@
         <w:pStyle w:val="Compact"/>
       </w:pPr>
       <w:r>
-        <w:t xml:space="preserve">Подтвердить перечень документов (заказ, счёт, реализация и УПД, заказ на производство; 52:04-52:31) и что о смене форм нужно уведомлять Битрикс24 (33:02) [INFERRED].</w:t>
+        <w:t xml:space="preserve">Подтвердить перечень документов (заказ, счёт, реализация и УПД, заказ на производство; 52:04-52:31) и что о смене форм нужно уведомлять Битрикс24 (33:02).</w:t>
       </w:r>
     </w:p>
     <w:bookmarkEnd w:id="30"/>
@@ -851,7 +771,7 @@
         <w:pStyle w:val="Compact"/>
       </w:pPr>
       <w:r>
-        <w:t xml:space="preserve">Контакты Виталия (Telegram, почта, телефон). Зачем: прямой канал связи. Кто: Роман. Метка: PROVEN (01:00:32).</w:t>
+        <w:t xml:space="preserve">Контакты Виталия (Telegram, почта, телефон). Зачем: прямой канал связи. Кто: Роман.</w:t>
       </w:r>
     </w:p>
     <w:p>
@@ -863,7 +783,7 @@
         <w:pStyle w:val="Compact"/>
       </w:pPr>
       <w:r>
-        <w:t xml:space="preserve">Описание бота или механизма интеграции и пользователя-бота на портале [имя пользователя-бота — уточнить у Андрея/Романа], без паролей (В3, В11). Зачем: понять автоматизацию на портале. Кто: Виталий, Андрей, Роман. Метка: UNVERIFIED.</w:t>
+        <w:t xml:space="preserve">Описание бота или механизма интеграции и пользователя-бота на портале [имя пользователя-бота — уточнить у Андрея/Романа], без паролей (В3, В11). Зачем: понять автоматизацию на портале. Кто: Виталий, Андрей, Роман.</w:t>
       </w:r>
     </w:p>
     <w:p>
@@ -875,7 +795,7 @@
         <w:pStyle w:val="Compact"/>
       </w:pPr>
       <w:r>
-        <w:t xml:space="preserve">Таблица соответствия состояний 1С и этапов сделки Битрикс, включая этапы с доски Miro (В16). Зачем: согласовать неизменяемую статусную модель. Кто: Роман, с технической частью от Виталия. Метка: «Мира доска» упомянута PROVEN (51:27), что это Miro INFERRED, таблица UNVERIFIED.</w:t>
+        <w:t xml:space="preserve">Таблица соответствия состояний 1С и этапов сделки Битрикс, включая этапы с доски Miro (В16). Зачем: согласовать неизменяемую статусную модель. Кто: Роман, с технической частью от Виталия.</w:t>
       </w:r>
     </w:p>
     <w:p>
@@ -887,7 +807,7 @@
         <w:pStyle w:val="Compact"/>
       </w:pPr>
       <w:r>
-        <w:t xml:space="preserve">Список печатных форм и документов для передачи в Битрикс, образцы PDF без персональных данных (В17, В18). Зачем: определить состав таймлайна и способ формирования. Кто: Роман, Виталий. Метка: частично PROVEN (00:33), перечень UNVERIFIED.</w:t>
+        <w:t xml:space="preserve">Список печатных форм и документов для передачи в Битрикс, образцы PDF без персональных данных (В17, В18). Зачем: определить состав таймлайна и способ формирования. Кто: Роман, Виталий.</w:t>
       </w:r>
     </w:p>
     <w:p>
@@ -899,7 +819,7 @@
         <w:pStyle w:val="Compact"/>
       </w:pPr>
       <w:r>
-        <w:t xml:space="preserve">Описание ценообразования и правил разноски оплат (В20, В22). Зачем: понять, какие данные идут в Битрикс. Кто: Виталий, Роман. Метка: UNVERIFIED.</w:t>
+        <w:t xml:space="preserve">Описание ценообразования и правил разноски оплат (В20, В22). Зачем: понять, какие данные идут в Битрикс. Кто: Виталий, Роман.</w:t>
       </w:r>
     </w:p>
     <w:p>
@@ -911,7 +831,7 @@
         <w:pStyle w:val="Compact"/>
       </w:pPr>
       <w:r>
-        <w:t xml:space="preserve">Описание сбоя и восстановления базы: дата, причина, использованная копия (В13). Зачем: оценить достоверность данных. Кто: Виталий, Роман. Метка: UNVERIFIED.</w:t>
+        <w:t xml:space="preserve">Описание сбоя и восстановления базы: дата, причина, использованная копия (В13). Зачем: оценить достоверность данных. Кто: Виталий, Роман.</w:t>
       </w:r>
     </w:p>
     <w:p>
@@ -923,7 +843,7 @@
         <w:pStyle w:val="Compact"/>
       </w:pPr>
       <w:r>
-        <w:t xml:space="preserve">Перечень ролей и пользователей 1С (по ролям, без паролей) (В10, В11). Зачем: понять, кто работает в 1С и в Битрикс. Кто: Роман, Виталий. Метка: общая картина PROVEN (54:21), перечень UNVERIFIED.</w:t>
+        <w:t xml:space="preserve">Перечень ролей и пользователей 1С (по ролям, без паролей) (В10, В11). Зачем: понять, кто работает в 1С и в Битрикс. Кто: Роман, Виталий.</w:t>
       </w:r>
     </w:p>
     <w:p>
@@ -935,7 +855,7 @@
         <w:pStyle w:val="Compact"/>
       </w:pPr>
       <w:r>
-        <w:t xml:space="preserve">Копия базы или доступ к тестовой базе и подписанное соглашение (В23). Зачем: изучение и разработка. Кто: Роман подписывает соглашение, Виталий готовит копию. Метка: PROVEN (59:47), PROVEN (01:00:01).</w:t>
+        <w:t xml:space="preserve">Копия базы или доступ к тестовой базе и подписанное соглашение (В23). Зачем: изучение и разработка. Кто: Роман подписывает соглашение, Виталий готовит копию.</w:t>
       </w:r>
     </w:p>
     <w:bookmarkEnd w:id="31"/>

</xml_diff>